<commit_message>
docs: restore original source numbers (LdP 2018 = 17, QC = 18, TV = 19)
Keep López de Prado 2018 at its original master-list index 17;
QuantConnect/LEAN 18, TradingView 19. Update Chapter 2 in-text citations
to match.

Co-Authored-By: Claude Opus 4.8 <noreply@anthropic.com>
Claude-Session: https://claude.ai/code/session_013r7ovPSZArf9XucUhV1eXv
</commit_message>
<xml_diff>
--- a/docs/Kapitola2_Data_a_metodologie.docx
+++ b/docs/Kapitola2_Data_a_metodologie.docx
@@ -44,7 +44,7 @@
         <w:jc w:val="both"/>
       </w:pPr>
       <w:r>
-        <w:t xml:space="preserve">Veškerá historická data i výpočetní zázemí pocházejí z platformy QuantConnect, konkrétně z jejího enginu LEAN (17). Pracoval jsem s minutovými daty, protože strategie je vnitrodenní a hrubší rozlišení by pravidla nedokázalo věrně napodobit. Vlastní statistické analýzy a grafy jsem zpracoval v jazyce Python (knihovny pandas, NumPy, SciPy a Matplotlib). Výsledný indikátor pro živé sledování trhu jsem naprogramoval v jazyce Pine Script na platformě TradingView (18).</w:t>
+        <w:t xml:space="preserve">Veškerá historická data i výpočetní zázemí pocházejí z platformy QuantConnect, konkrétně z jejího enginu LEAN (18). Pracoval jsem s minutovými daty, protože strategie je vnitrodenní a hrubší rozlišení by pravidla nedokázalo věrně napodobit. Vlastní statistické analýzy a grafy jsem zpracoval v jazyce Python (knihovny pandas, NumPy, SciPy a Matplotlib). Výsledný indikátor pro živé sledování trhu jsem naprogramoval v jazyce Pine Script na platformě TradingView (19).</w:t>
       </w:r>
     </w:p>
     <w:p>
@@ -219,7 +219,7 @@
         <w:jc w:val="both"/>
       </w:pPr>
       <w:r>
-        <w:t xml:space="preserve">Základní obranou proti přeučení je oddělit data, na kterých se strategie vyvíjí, od dat, na kterých se ověřuje (11). Celý vývoj, ladění filtrů i volbu parametrů jsem prováděl výhradně na vývojovém období 2018–2025. Ověřovací období od října 2025 jsem držel oddělené a test na něm provedl až úplně nakonec, a to jen jednou. Opakované testování na téže ověřovací množině by ji totiž postupně proměnilo v další vývojová data a připravilo o vypovídací hodnotu (19). Právě jednorázovost tohoto testu je důvod, proč jsem ověřovací období od začátku uložil zvlášť a během průzkumné analýzy je „neviděl“.</w:t>
+        <w:t xml:space="preserve">Základní obranou proti přeučení je oddělit data, na kterých se strategie vyvíjí, od dat, na kterých se ověřuje (11). Celý vývoj, ladění filtrů i volbu parametrů jsem prováděl výhradně na vývojovém období 2018–2025. Ověřovací období od října 2025 jsem držel oddělené a test na něm provedl až úplně nakonec, a to jen jednou. Opakované testování na téže ověřovací množině by ji totiž postupně proměnilo v další vývojová data a připravilo o vypovídací hodnotu (17). Právě jednorázovost tohoto testu je důvod, proč jsem ověřovací období od začátku uložil zvlášť a během průzkumné analýzy je „neviděl“.</w:t>
       </w:r>
     </w:p>
     <w:p>

</xml_diff>